<commit_message>
Add PictRecorder for improved processing of DOCX pict elements
Introduce `PictRecorder` to handle DOCX pictographic elements and anchor IDs, replacing earlier inline content processing. This enhances placeholder replacement in text boxes and improves AsciiDoc conversion fidelity by recording pict details and restructuring related tests and documentation logic.
</commit_message>
<xml_diff>
--- a/test/sources/ExpressionReplacementInTextBoxesTest.docx
+++ b/test/sources/ExpressionReplacementInTextBoxesTest.docx
@@ -1,6 +1,6 @@
 
 <file path=word/document.xml><?xml version="1.0" encoding="utf-8"?>
-<w:document xmlns:wpc="http://schemas.microsoft.com/office/word/2010/wordprocessingCanvas" xmlns:cx="http://schemas.microsoft.com/office/drawing/2014/chartex" xmlns:cx1="http://schemas.microsoft.com/office/drawing/2015/9/8/chartex" xmlns:cx2="http://schemas.microsoft.com/office/drawing/2015/10/21/chartex" xmlns:cx3="http://schemas.microsoft.com/office/drawing/2016/5/9/chartex" xmlns:cx4="http://schemas.microsoft.com/office/drawing/2016/5/10/chartex" xmlns:cx5="http://schemas.microsoft.com/office/drawing/2016/5/11/chartex" xmlns:cx6="http://schemas.microsoft.com/office/drawing/2016/5/12/chartex" xmlns:cx7="http://schemas.microsoft.com/office/drawing/2016/5/13/chartex" xmlns:cx8="http://schemas.microsoft.com/office/drawing/2016/5/14/chartex" xmlns:mc="http://schemas.openxmlformats.org/markup-compatibility/2006" xmlns:aink="http://schemas.microsoft.com/office/drawing/2016/ink" xmlns:am3d="http://schemas.microsoft.com/office/drawing/2017/model3d" xmlns:o="urn:schemas-microsoft-com:office:office" xmlns:oel="http://schemas.microsoft.com/office/2019/extlst" xmlns:r="http://schemas.openxmlformats.org/officeDocument/2006/relationships" xmlns:m="http://schemas.openxmlformats.org/officeDocument/2006/math" xmlns:v="urn:schemas-microsoft-com:vml" xmlns:wp14="http://schemas.microsoft.com/office/word/2010/wordprocessingDrawing" xmlns:wp="http://schemas.openxmlformats.org/drawingml/2006/wordprocessingDrawing" xmlns:w10="urn:schemas-microsoft-com:office:word" xmlns:w="http://schemas.openxmlformats.org/wordprocessingml/2006/main" xmlns:w14="http://schemas.microsoft.com/office/word/2010/wordml" xmlns:w15="http://schemas.microsoft.com/office/word/2012/wordml" xmlns:w16cex="http://schemas.microsoft.com/office/word/2018/wordml/cex" xmlns:w16cid="http://schemas.microsoft.com/office/word/2016/wordml/cid" xmlns:w16="http://schemas.microsoft.com/office/word/2018/wordml" xmlns:w16du="http://schemas.microsoft.com/office/word/2023/wordml/word16du" xmlns:w16sdtdh="http://schemas.microsoft.com/office/word/2020/wordml/sdtdatahash" xmlns:w16se="http://schemas.microsoft.com/office/word/2015/wordml/symex" xmlns:wpg="http://schemas.microsoft.com/office/word/2010/wordprocessingGroup" xmlns:wpi="http://schemas.microsoft.com/office/word/2010/wordprocessingInk" xmlns:wne="http://schemas.microsoft.com/office/word/2006/wordml" xmlns:wps="http://schemas.microsoft.com/office/word/2010/wordprocessingShape" mc:Ignorable="w14 w15 w16se w16cid w16 w16cex w16sdtdh w16du wp14">
+<w:document xmlns:wpc="http://schemas.microsoft.com/office/word/2010/wordprocessingCanvas" xmlns:cx="http://schemas.microsoft.com/office/drawing/2014/chartex" xmlns:cx1="http://schemas.microsoft.com/office/drawing/2015/9/8/chartex" xmlns:cx2="http://schemas.microsoft.com/office/drawing/2015/10/21/chartex" xmlns:cx3="http://schemas.microsoft.com/office/drawing/2016/5/9/chartex" xmlns:cx4="http://schemas.microsoft.com/office/drawing/2016/5/10/chartex" xmlns:cx5="http://schemas.microsoft.com/office/drawing/2016/5/11/chartex" xmlns:cx6="http://schemas.microsoft.com/office/drawing/2016/5/12/chartex" xmlns:cx7="http://schemas.microsoft.com/office/drawing/2016/5/13/chartex" xmlns:cx8="http://schemas.microsoft.com/office/drawing/2016/5/14/chartex" xmlns:mc="http://schemas.openxmlformats.org/markup-compatibility/2006" xmlns:aink="http://schemas.microsoft.com/office/drawing/2016/ink" xmlns:am3d="http://schemas.microsoft.com/office/drawing/2017/model3d" xmlns:o="urn:schemas-microsoft-com:office:office" xmlns:oel="http://schemas.microsoft.com/office/2019/extlst" xmlns:r="http://schemas.openxmlformats.org/officeDocument/2006/relationships" xmlns:m="http://schemas.openxmlformats.org/officeDocument/2006/math" xmlns:v="urn:schemas-microsoft-com:vml" xmlns:wp14="http://schemas.microsoft.com/office/word/2010/wordprocessingDrawing" xmlns:wp="http://schemas.openxmlformats.org/drawingml/2006/wordprocessingDrawing" xmlns:w10="urn:schemas-microsoft-com:office:word" xmlns:w="http://schemas.openxmlformats.org/wordprocessingml/2006/main" xmlns:w14="http://schemas.microsoft.com/office/word/2010/wordml" xmlns:w15="http://schemas.microsoft.com/office/word/2012/wordml" xmlns:w16cex="http://schemas.microsoft.com/office/word/2018/wordml/cex" xmlns:w16cid="http://schemas.microsoft.com/office/word/2016/wordml/cid" xmlns:w16="http://schemas.microsoft.com/office/word/2018/wordml" xmlns:w16du="http://schemas.microsoft.com/office/word/2023/wordml/word16du" xmlns:w16sdtdh="http://schemas.microsoft.com/office/word/2020/wordml/sdtdatahash" xmlns:w16sdtfl="http://schemas.microsoft.com/office/word/2024/wordml/sdtformatlock" xmlns:w16se="http://schemas.microsoft.com/office/word/2015/wordml/symex" xmlns:wpg="http://schemas.microsoft.com/office/word/2010/wordprocessingGroup" xmlns:wpi="http://schemas.microsoft.com/office/word/2010/wordprocessingInk" xmlns:wne="http://schemas.microsoft.com/office/word/2006/wordml" xmlns:wps="http://schemas.microsoft.com/office/word/2010/wordprocessingShape" mc:Ignorable="w14 w15 w16se w16cid w16 w16cex w16sdtdh w16sdtfl w16du wp14">
   <w:body>
     <w:p>
       <w:pPr>
@@ -24,26 +24,15 @@
       <w:proofErr w:type="spellEnd"/>
     </w:p>
     <w:p>
-      <w:pPr>
-        <w:rPr>
-          <w:rFonts w:hint="eastAsia"/>
-        </w:rPr>
-      </w:pPr>
-      <w:r>
-        <w:rPr>
-          <w:rFonts w:hint="eastAsia"/>
-        </w:rPr>
+      <w:r>
         <w:pict w14:anchorId="363CAD83">
-          <v:roundrect id="Text Frame 1" o:spid="_x0000_s1029" style="position:absolute;margin-left:-417.95pt;margin-top:0;width:85.05pt;height:17pt;z-index:251659264;visibility:visible;mso-wrap-distance-left:0;mso-wrap-distance-top:0;mso-wrap-distance-right:0;mso-wrap-distance-bottom:0;mso-position-horizontal:right;mso-position-horizontal-relative:text;mso-position-vertical:absolute;v-text-anchor:top" arcsize="10923f" o:allowincell="f" fillcolor="white [3201]" strokecolor="#e97132 [3205]" strokeweight="2.5pt">
+          <v:roundrect id="Text Frame 1" o:spid="_x0000_s1029" style="position:absolute;margin-left:427.2pt;margin-top:0;width:85.05pt;height:17pt;z-index:251659264;visibility:visible;mso-wrap-distance-left:0;mso-wrap-distance-top:0;mso-wrap-distance-right:0;mso-wrap-distance-bottom:0;mso-position-horizontal:right;mso-position-horizontal-relative:text;mso-position-vertical:absolute;v-text-anchor:top" arcsize="10923f" o:allowincell="f" fillcolor="white [3201]" strokecolor="#e97132 [3205]" strokeweight="2.5pt">
             <v:shadow color="#868686"/>
             <v:textbox style="mso-next-textbox:#Text Frame 1" inset="0,0,0,0">
               <w:txbxContent>
                 <w:p>
                   <w:pPr>
                     <w:overflowPunct w:val="0"/>
-                    <w:rPr>
-                      <w:rFonts w:hint="eastAsia"/>
-                    </w:rPr>
                   </w:pPr>
                   <w:r>
                     <w:t>${</w:t>
@@ -99,26 +88,15 @@
       </w:r>
     </w:p>
     <w:p>
-      <w:pPr>
-        <w:rPr>
-          <w:rFonts w:hint="eastAsia"/>
-        </w:rPr>
-      </w:pPr>
-      <w:r>
-        <w:rPr>
-          <w:rFonts w:hint="eastAsia"/>
-        </w:rPr>
+      <w:r>
         <w:pict w14:anchorId="6826989D">
-          <v:roundrect id="Text Frame 2" o:spid="_x0000_s1030" style="position:absolute;margin-left:33.85pt;margin-top:0;width:85.05pt;height:17pt;z-index:251658240;visibility:visible;mso-wrap-distance-left:0;mso-wrap-distance-top:0;mso-wrap-distance-right:0;mso-wrap-distance-bottom:0;mso-position-horizontal:right;mso-position-horizontal-relative:text;mso-position-vertical:absolute;v-text-anchor:top" arcsize="10923f" o:allowincell="f" fillcolor="white [3201]" strokecolor="#156082 [3204]" strokeweight="2.5pt">
+          <v:roundrect id="Text Frame 2" o:spid="_x0000_s1030" style="position:absolute;margin-left:67.7pt;margin-top:0;width:85.05pt;height:17pt;z-index:251658240;visibility:visible;mso-wrap-distance-left:0;mso-wrap-distance-top:0;mso-wrap-distance-right:0;mso-wrap-distance-bottom:0;mso-position-horizontal:right;mso-position-horizontal-relative:text;mso-position-vertical:absolute;v-text-anchor:top" arcsize="10923f" o:allowincell="f" fillcolor="white [3201]" strokecolor="#156082 [3204]" strokeweight="2.5pt">
             <v:shadow color="#868686"/>
             <v:textbox style="mso-next-textbox:#Text Frame 2" inset="0,0,0,0">
               <w:txbxContent>
                 <w:p>
                   <w:pPr>
                     <w:overflowPunct w:val="0"/>
-                    <w:rPr>
-                      <w:rFonts w:hint="eastAsia"/>
-                    </w:rPr>
                   </w:pPr>
                   <w:r>
                     <w:t>${</w:t>
@@ -169,7 +147,7 @@
 </file>
 
 <file path=word/styles.xml><?xml version="1.0" encoding="utf-8"?>
-<w:styles xmlns:mc="http://schemas.openxmlformats.org/markup-compatibility/2006" xmlns:r="http://schemas.openxmlformats.org/officeDocument/2006/relationships" xmlns:w="http://schemas.openxmlformats.org/wordprocessingml/2006/main" xmlns:w14="http://schemas.microsoft.com/office/word/2010/wordml" xmlns:w15="http://schemas.microsoft.com/office/word/2012/wordml" xmlns:w16cex="http://schemas.microsoft.com/office/word/2018/wordml/cex" xmlns:w16cid="http://schemas.microsoft.com/office/word/2016/wordml/cid" xmlns:w16="http://schemas.microsoft.com/office/word/2018/wordml" xmlns:w16du="http://schemas.microsoft.com/office/word/2023/wordml/word16du" xmlns:w16sdtdh="http://schemas.microsoft.com/office/word/2020/wordml/sdtdatahash" xmlns:w16se="http://schemas.microsoft.com/office/word/2015/wordml/symex" mc:Ignorable="w14 w15 w16se w16cid w16 w16cex w16sdtdh w16du">
+<w:styles xmlns:mc="http://schemas.openxmlformats.org/markup-compatibility/2006" xmlns:r="http://schemas.openxmlformats.org/officeDocument/2006/relationships" xmlns:w="http://schemas.openxmlformats.org/wordprocessingml/2006/main" xmlns:w14="http://schemas.microsoft.com/office/word/2010/wordml" xmlns:w15="http://schemas.microsoft.com/office/word/2012/wordml" xmlns:w16cex="http://schemas.microsoft.com/office/word/2018/wordml/cex" xmlns:w16cid="http://schemas.microsoft.com/office/word/2016/wordml/cid" xmlns:w16="http://schemas.microsoft.com/office/word/2018/wordml" xmlns:w16du="http://schemas.microsoft.com/office/word/2023/wordml/word16du" xmlns:w16sdtdh="http://schemas.microsoft.com/office/word/2020/wordml/sdtdatahash" xmlns:w16sdtfl="http://schemas.microsoft.com/office/word/2024/wordml/sdtformatlock" xmlns:w16se="http://schemas.microsoft.com/office/word/2015/wordml/symex" mc:Ignorable="w14 w15 w16se w16cid w16 w16cex w16sdtdh w16sdtfl w16du">
   <w:docDefaults>
     <w:rPrDefault>
       <w:rPr>

</xml_diff>